<commit_message>
feat: Figma Edition Modern Desktop & Web Dashboard, theme-adaptive icons, and portable setup
</commit_message>
<xml_diff>
--- a/DRAF_BAB_1_SKRIPSI_NOUVAL.docx
+++ b/DRAF_BAB_1_SKRIPSI_NOUVAL.docx
@@ -141,7 +141,7 @@
           <w:rFonts w:ascii="Times New Roman" w:hAnsi="Times New Roman"/>
           <w:sz w:val="24"/>
         </w:rPr>
-        <w:t>Guna mengatasi ketiga keterbatasan mendasar tersebut, penelitian ini mengusulkan penerapan algoritma Light Gradient Boosting Machine (LightGBM) yang diintegrasikan ke dalam arsitektur Multi-Source Feature Fusion 36 variabel terstandarisasi. Algoritma LightGBM dipilih karena memiliki keunggulan arsitektural mutakhir dibandingkan model tree-based konvensional lainnya seperti Random Forest dan XGBoost. LightGBM menerapkan teknik Gradient-based One-Side Sampling (GOSS) untuk menyaring instans data berdasarkan gradien kesalahan serta Exclusive Feature Bundling (EFB) untuk mereduksi dimensi fitur tanpa kehilangan informasi esensial (Ke et al., 2017). Selain itu, strategi pertumbuhan pohon berbasis daun (Leaf-wise Tree Growth with Depth Limitation) memungkinkan LightGBM mencapai konvergensi loss yang jauh lebih dalam dengan kecepatan komputasi 10 hingga 20 kali lebih cepat dan efisiensi memori yang jauh lebih unggul dibandingkan XGBoost maupun arsitektur Deep Learning (Zhou et al., 2025; Du et al., 2023). Karakteristik komputasi ultra-cepat ini sangat krusial untuk sistem perdagangan terotomasi yang menuntut inferensi probabilitas real-time dengan latensi nol (zero-delay) pada penutupan candle M15 dan M5.</w:t>
+        <w:t>Guna mengatasi ketiga keterbatasan mendasar tersebut, penelitian ini mengusulkan penerapan algoritma Light Gradient Boosting Machine (LightGBM) yang diintegrasikan ke dalam arsitektur Multi-Source Feature Fusion 44 variabel terstandarisasi. Algoritma LightGBM dipilih karena memiliki keunggulan arsitektural mutakhir dibandingkan model tree-based konvensional lainnya seperti Random Forest dan XGBoost. LightGBM menerapkan teknik Gradient-based One-Side Sampling (GOSS) untuk menyaring instans data berdasarkan gradien kesalahan serta Exclusive Feature Bundling (EFB) untuk mereduksi dimensi fitur tanpa kehilangan informasi esensial (Ke et al., 2017). Selain itu, strategi pertumbuhan pohon berbasis daun (Leaf-wise Tree Growth with Depth Limitation) memungkinkan LightGBM mencapai konvergensi loss yang jauh lebih dalam dengan kecepatan komputasi 10 hingga 20 kali lebih cepat dan efisiensi memori yang jauh lebih unggul dibandingkan XGBoost maupun arsitektur Deep Learning (Zhou et al., 2025; Du et al., 2023). Karakteristik komputasi ultra-cepat ini sangat krusial untuk sistem perdagangan terotomasi yang menuntut inferensi probabilitas real-time dengan latensi nol (zero-delay) pada penutupan candle M15 (15-Minute Sweet Spot Timeframe).</w:t>
       </w:r>
     </w:p>
     <w:p>
@@ -150,12 +150,13 @@
         <w:ind w:firstLine="562"/>
         <w:jc w:val="both"/>
       </w:pPr>
+      <w:r/>
       <w:r>
         <w:rPr>
           <w:rFonts w:ascii="Times New Roman" w:hAnsi="Times New Roman"/>
           <w:sz w:val="24"/>
         </w:rPr>
-        <w:t>Sistem yang dibangun dalam penelitian ini mengonstruksi 36 variabel fitur prediktif yang menggabungkan empat pilar domain: (1) Geometri Candlestick dan Momentum Intraday (M15 dan M5); (2) Struktur Geometri Institusional Smart Money Concepts (Order Block Bullish/Bearish, Fair Value Gap Bullish/Bearish, Break of Structure, Change of Character, Liquidity Sweep, dan Fibonacci Retracement); (3) Jangkar Tren Multi-Timeframe Makro H4 dan H1 (EMA 50 dan EMA 200); serta (4) Kanal Makroekonomi &amp; Intermarket DXY (rasio return XAU/DXY, tren DXY, dan siklus rilis berita berdampak tinggi NFP, CPI, serta FOMC). Model LightGBM dilatih dengan pembobotan kelas seimbang (balanced class weights) untuk menghasilkan estimasi probabilitas arah pergerakan yang terkalibrasi halus (0.0% – 100.0%). Keputusan eksekusi transaksi hanya dipicu apabila probabilitas model melampaui ambang batas keyakinan tinggi (confidence threshold ≥ 65%), dan langsung dihubungkan dengan terminal MetaTrader 5 API yang dipersenjatai manajemen risiko ketat berbasis Average True Range (ATR), rasio Risk-to-Reward (RRR) terukur 1 : 2.5, pembatasan kerugian harian maksimum (Max Daily Losses), cooldown period, serta pencatatan log evaluasi skenario perdagangan secara otomatis.</w:t>
+        <w:t>Sistem yang dibangun dalam penelitian ini mengonstruksi 44 variabel fitur prediktif yang menggabungkan empat pilar domain: (1) Geometri Candlestick dan Momentum Intraday Timeframe M15; (2) Struktur Geometri Institusional Smart Money Concepts (Order Block Bullish/Bearish, Fair Value Gap Bullish/Bearish, Break of Structure, Change of Character, Liquidity Sweep, dan Fibonacci Retracement); (3) Jangkar dan Kemiringan Tren Multi-Timeframe Makro H4 dan H1 (EMA 50, EMA 200, slope kanal linier, ADX 14, serta volume ratio); serta (4) Kanal Makroekonomi Dinamis &amp; Intermarket DXY (multi-lag return DXY, rasio XAU/DXY, hitung mundur menit menuju rilis berita berdampak tinggi / minutes-to-news, deviasi bias ekspektasi konsensus ekonom [forecast vs previous], bobot numerik dampak berita, serta siklus rilis NFP, CPI, dan FOMC). Model LightGBM dioptimasi dengan penerapan regularisasi L1/L2 (reg_alpha dan reg_lambda) serta pembobotan kelas seimbang (balanced class weights) untuk meredam overfitting terhadap derau acak pasar dan menghasilkan estimasi probabilitas arah pergerakan yang terkalibrasi halus (0.0% – 100.0%). Keseluruhan arsitektur beroperasi dalam skema dua tingkat (Two-Tier Architecture), di mana Tingkat 1 (Machine Learning Classifier) bertindak sebagai penyaring probabilitas momentum arah pergerakan harga 5 candle (75 menit) dengan ambang batas keyakinan tinggi (confidence threshold ≥ 65% – 70%), sedangkan Tingkat 2 (Structural SMC &amp; Dynamic RRR Engine) menentukan titik eksekusi hibrida (market order maupun pending limit order 50% body retracement saat terjadi lilin sweep impulsif) serta menetapkan target Take-Profit tepat pada batas likuiditas level kunci supply/demand terdekat yang dijangkarkan pada memori institusional D1 30-hari, disertai Stop-Loss proporsional dinamis (RRR terjamin ≥ 1 : 1.8 hingga 1 : 2.5), penolakan order jika ruang likuiditas terlalu sempit (Bad RRR Filter), filter proteksi anti counter-trend H4, Pre-News Caution Guard, serta mekanisme penguncian modal Auto Break-Even Point yang terbukti empiris mencegah akumulasi kerugian modal.</w:t>
       </w:r>
     </w:p>
     <w:p>
@@ -196,7 +197,7 @@
           <w:rFonts w:ascii="Times New Roman" w:hAnsi="Times New Roman"/>
           <w:sz w:val="24"/>
         </w:rPr>
-        <w:t>Berdasarkan uraian latar belakang masalah di atas, rumusan masalah dalam penelitian tugas akhir ini dirumuskan sebagai berikut:</w:t>
+        <w:t>Berdasarkan uraian latar belakang masalah di atas, rumusan masalah dalam penelitian tugas akhir ini dinyatakan dalam bentuk pernyataan masalah sebagai berikut:</w:t>
       </w:r>
     </w:p>
     <w:p>
@@ -217,7 +218,7 @@
           <w:rFonts w:ascii="Times New Roman" w:hAnsi="Times New Roman"/>
           <w:sz w:val="24"/>
         </w:rPr>
-        <w:t>Bagaimana merancang dan mengimplementasikan arsitektur Multi-Source Feature Fusion yang mengintegrasikan 36 variabel heterogen mencakup geometri candlestick, Smart Money Concepts (Order Block, FVG, BOS, CHoCH), korelasi intermarket Indeks Dolar AS (DXY), siklus berita makroekonomi (NFP, CPI, FOMC), serta jangkar tren multi-timeframe H4/H1 tanpa menimbulkan bias kebocoran data masa depan (lookahead bias / data leakage)?</w:t>
+        <w:t>Perancangan dan pengintegrasian arsitektur Multi-Source Feature Fusion yang memadukan 44 variabel prediktif heterogen mencakup geometri candlestick, Smart Money Concepts (Order Block, FVG, BOS, CHoCH), korelasi intermarket Indeks Dolar AS (DXY), variabel makroekonomi dinamis kontinu (minutes-to-news, bias ekspektasi forecast vs previous, bobot dampak berita, kalender NFP, CPI, FOMC), serta jangkar dan kemiringan tren multi-timeframe H4/H1 secara sinkron tanpa menimbulkan bias kebocoran data masa depan (lookahead bias / data leakage).</w:t>
       </w:r>
     </w:p>
     <w:p>
@@ -238,28 +239,21 @@
           <w:rFonts w:ascii="Times New Roman" w:hAnsi="Times New Roman"/>
           <w:sz w:val="24"/>
         </w:rPr>
-        <w:t>Bagaimana menerapkan dan mengoptimasi algoritma LightGBM Classifier dengan skema Leaf-wise Tree Growth, pembobotan kelas seimbang (balanced class weights), dan hyperparameter tuning sistematis guna menghasilkan estimasi probabilitas arah pergerakan harga XAUUSD yang terkalibrasi presisi pada timeframe M15 dan M5?</w:t>
+        <w:t>Penerapan dan pengoptimalan algoritma LightGBM Classifier dengan skema Leaf-wise Tree Growth, regularisasi L1/L2 (reg_alpha dan reg_lambda), pembobotan kelas seimbang (balanced class weights), serta hyperparameter tuning sistematis guna menghasilkan estimasi probabilitas arah pergerakan harga XAUUSD yang terkalibrasi presisi pada timeframe M15.</w:t>
       </w:r>
     </w:p>
     <w:p>
       <w:pPr>
-        <w:spacing w:line="360" w:lineRule="auto" w:after="80"/>
+        <w:spacing w:line="360" w:lineRule="auto" w:after="120"/>
         <w:ind w:left="562" w:hanging="360"/>
       </w:pPr>
-      <w:r>
-        <w:rPr>
-          <w:rFonts w:ascii="Times New Roman" w:hAnsi="Times New Roman"/>
-          <w:b/>
-          <w:sz w:val="24"/>
-        </w:rPr>
-        <w:t xml:space="preserve">3. </w:t>
-      </w:r>
+      <w:r/>
       <w:r>
         <w:rPr>
           <w:rFonts w:ascii="Times New Roman" w:hAnsi="Times New Roman"/>
           <w:sz w:val="24"/>
         </w:rPr>
-        <w:t>Bagaimana merancang arsitektur sistem eksekusi otomatis zero-delay terintegrasi MetaTrader 5 API yang menerapkan filter ambang batas keyakinan tinggi (high-conviction threshold ≥ 65%), filter tren multi-timeframe H4, serta manajemen risiko kuantitatif dinamis (Dynamic ATR Stop-Loss, Risk-to-Reward Ratio 1 : 2.5, Max Daily Losses, dan Cooldown Period)?</w:t>
+        <w:t>3. Perancangan dan pengimplementasian arsitektur sistem eksekusi terotomasi zero-delay terintegrasi MetaTrader 5 API berbasis Two-Tier Architecture, memadukan penapisan probabilitas arah LightGBM (ambang batas keyakinan ≥ 65% – 70%) dengan mesin eksekusi struktural SMC (Structural Dynamic RRR dengan penempatan Take-Profit pada batas likuiditas supply/demand terdekat, Stop-Loss proporsional dinamis RRR ≥ 1 : 1.8, memori jangkar institusional D1 30-hari, eksekusi hibrida market order dan 50% body retracement limit order berbatas waktu, proteksi anti counter-trend multi-timeframe H4, Pre-News Caution Guard, serta Auto Break-Even Point preservation).</w:t>
       </w:r>
     </w:p>
     <w:p>
@@ -280,7 +274,7 @@
           <w:rFonts w:ascii="Times New Roman" w:hAnsi="Times New Roman"/>
           <w:sz w:val="24"/>
         </w:rPr>
-        <w:t>Bagaimana membangun Post-Trade Scenario Evaluator Engine untuk mendiagnosa akar penyebab keberhasilan (Take Profit) maupun kegagalan (Stop Loss) pada setiap transaksi tertutup, serta menguji ketahanan setiap skenario pasar sebanyak 5 hingga 10 kali transaksi sebagai mekanisme evaluasi berkelanjutan (continuous learning) dan backtesting model?</w:t>
+        <w:t>Pembangunan dan pengujian modul Post-Trade Scenario Evaluator Engine untuk mendiagnosa secara transparan akar penyebab keberhasilan (Take Profit) maupun kegagalan (Stop Loss) pada setiap transaksi tertutup, serta menguji ketahanan skenario pasar 5 hingga 10 kali transaksi sebagai mekanisme evaluasi berkelanjutan (continuous learning) model.</w:t>
       </w:r>
     </w:p>
     <w:p>
@@ -301,7 +295,7 @@
           <w:rFonts w:ascii="Times New Roman" w:hAnsi="Times New Roman"/>
           <w:sz w:val="24"/>
         </w:rPr>
-        <w:t>Bagaimana efektivitas dan kinerja model LightGBM yang dibangun jika dibandingkan dengan algoritma machine learning pembanding (XGBoost dan Random Forest) berdasarkan metrik evaluasi klasifikasi statistik (ROC-AUC, Log Loss, Precision, Recall, F1-Score) serta metrik profitabilitas forward testing pasar nyata (Win Rate, Profit Factor, Drawdown, dan Return on Investment)?</w:t>
+        <w:t>Pengukuran dan evaluasi komparasi kinerja model LightGBM terhadap algoritma machine learning pembanding (XGBoost dan Random Forest) berdasarkan metrik evaluasi klasifikasi statistik (ROC-AUC, Log Loss, Precision, Recall, F1-Score) serta metrik profitabilitas forward testing pasar nyata (Win Rate, Profit Factor, Maksimum Drawdown, dan Return on Investment).</w:t>
       </w:r>
     </w:p>
     <w:p>
@@ -370,7 +364,7 @@
           <w:rFonts w:ascii="Times New Roman" w:hAnsi="Times New Roman"/>
           <w:sz w:val="24"/>
         </w:rPr>
-        <w:t>Data historis yang digunakan untuk pelatihan dan validasi model bersumber dari penarikan candle real-time MetaTrader 5 broker teregulasi sebanyak 50.000 candle pada timeframe operasional M15 (Intraday Swing) dan M5 (High-Precision Scalping), dengan data konfirmasi tren makro pada timeframe H1 dan H4.</w:t>
+        <w:t>Data historis yang digunakan untuk pelatihan dan validasi model bersumber dari penarikan candle real-time MetaTrader 5 broker teregulasi sebanyak 50.000 candle pada timeframe operasional utama M15 (15-Minute Intraday) sebagai zona waktu paling optimal (sweet spot) yang memadukan kecepatan eksekusi dengan minimnya derau acak (noise), didukung data konfirmasi tren makro pada timeframe H1 dan H4.</w:t>
       </w:r>
     </w:p>
     <w:p>
@@ -391,7 +385,7 @@
           <w:rFonts w:ascii="Times New Roman" w:hAnsi="Times New Roman"/>
           <w:sz w:val="24"/>
         </w:rPr>
-        <w:t>Variabel masukan (fitur independen) dibatasi pada 36 variabel terstandarisasi yang mencakup: Geometri Candlestick, Smart Money Concepts (Order Block Bullish &amp; Bearish, Fair Value Gap, Break of Structure, Change of Character, Liquidity Sweep), Fibonacci Retracement (rasio 0.382, 0.500, 0.618), Indikator Momentum (RSI 14, Bollinger Bands Bandwidth, ATR 14), Korelasi Intermarket Indeks Dolar AS (DXY), serta fitur biner indikator kalender makroekonomi (minggu rilis NFP, hari rilis CPI, dan minggu rilis FOMC).</w:t>
+        <w:t>Variabel masukan (fitur independen) dibatasi pada 44 variabel terstandarisasi yang mencakup 4 pilar domain: Geometri Candlestick dan Momentum Intraday M15, Smart Money Concepts (Order Block Bullish &amp; Bearish, Fair Value Gap, Break of Structure, Change of Character, Liquidity Sweep), Fibonacci Retracement (rasio 0.382, 0.500, 0.618), Indikator Tren &amp; Volatilitas (RSI 14, Bollinger Bands Bandwidth, ATR 14, ADX 14, serta slope kanal linier tren H4), Korelasi Intermarket Indeks Dolar AS (DXY multi-lag return dan rasio XAU/DXY), serta variabel makroekonomi dinamis (hitung mundur waktu menuju rilis berita High-Impact / minutes-to-news, deviasi bias ekspektasi konsensus pasar / forecast vs previous, bobot numerik dampak berita, serta siklus rilis NFP, CPI, dan FOMC).</w:t>
       </w:r>
     </w:p>
     <w:p>
@@ -417,44 +411,30 @@
     </w:p>
     <w:p>
       <w:pPr>
-        <w:spacing w:line="360" w:lineRule="auto" w:after="80"/>
+        <w:spacing w:line="360" w:lineRule="auto" w:after="120"/>
         <w:ind w:left="562" w:hanging="360"/>
       </w:pPr>
-      <w:r>
-        <w:rPr>
-          <w:rFonts w:ascii="Times New Roman" w:hAnsi="Times New Roman"/>
-          <w:b/>
-          <w:sz w:val="24"/>
-        </w:rPr>
-        <w:t xml:space="preserve">5. </w:t>
-      </w:r>
+      <w:r/>
       <w:r>
         <w:rPr>
           <w:rFonts w:ascii="Times New Roman" w:hAnsi="Times New Roman"/>
           <w:sz w:val="24"/>
         </w:rPr>
-        <w:t>Target luaran model merupakan probabilitas klasifikasi biner arah pergerakan harga 5 candle ke depan (label 1 untuk kenaikan harga di atas ambang ATR, dan label 0 untuk penurunan/stagnan) dengan penerapan ambang batas keyakinan tinggi (confidence threshold) ≥ 65.0%.</w:t>
+        <w:t>5. Target luaran model machine learning dibatasi pada estimasi probabilitas klasifikasi biner arah pergerakan harga horizon 5 candle M15 ke depan / T+5 = 75 menit (label 1 untuk kenaikan harga di atas ambang batas volatilitas ATR, dan label 0 untuk penurunan/stagnan) dengan penerapan ambang batas keyakinan tinggi (confidence threshold ≥ 65.0% – 70.0%), sedangkan penentuan target Take-Profit dan Stop-Loss ditangani secara terpisah oleh mesin struktural SMC berbasis level kunci likuiditas dan rasio Risk-to-Reward terukur.</w:t>
       </w:r>
     </w:p>
     <w:p>
       <w:pPr>
-        <w:spacing w:line="360" w:lineRule="auto" w:after="80"/>
+        <w:spacing w:line="360" w:lineRule="auto" w:after="120"/>
         <w:ind w:left="562" w:hanging="360"/>
       </w:pPr>
-      <w:r>
-        <w:rPr>
-          <w:rFonts w:ascii="Times New Roman" w:hAnsi="Times New Roman"/>
-          <w:b/>
-          <w:sz w:val="24"/>
-        </w:rPr>
-        <w:t xml:space="preserve">6. </w:t>
-      </w:r>
+      <w:r/>
       <w:r>
         <w:rPr>
           <w:rFonts w:ascii="Times New Roman" w:hAnsi="Times New Roman"/>
           <w:sz w:val="24"/>
         </w:rPr>
-        <w:t>Pengujian operasional sistem (live forward testing) dilakukan secara otomatis melalui koneksi MetaTrader 5 Python API pada akun forward testing dengan saldo evaluasi awal terstandarisasi sebesar $500.00 USD, menerapkan ukuran lot terkontrol (0.01 lot), rasio Risk-to-Reward minimal 1 : 2.5, batas maksimal posisi terbuka bertumpuk (max stacked positions = 2), serta batas toleransi kerugian harian maksimum (max daily losses = 5 trade).</w:t>
+        <w:t>6. Pengujian operasional sistem (live forward testing) dilakukan secara otomatis melalui koneksi MetaTrader 5 Python API pada akun forward testing dengan saldo evaluasi awal terstandarisasi sebesar .00 USD, menerapkan ukuran lot terkontrol (0.01 lot), rasio Risk-to-Reward struktural minimal 1 : 1.8 hingga 1 : 2.5, batas waktu pembatalan pending limit order otomatis 45 menit (3 candle M15), proteksi penguncian modal Auto Break-Even Point (+0.20 USD saat floating profit mencapai +.00 USD), batas maksimal posisi terbuka bertumpuk (max stacked positions = 2), serta batas toleransi kerugian harian maksimum (max daily losses = 5 trade).</w:t>
       </w:r>
     </w:p>
     <w:p>
@@ -523,7 +503,7 @@
           <w:rFonts w:ascii="Times New Roman" w:hAnsi="Times New Roman"/>
           <w:sz w:val="24"/>
         </w:rPr>
-        <w:t>Membangun dan menguji pipeline Multi-Source Feature Fusion yang mampu mengintegrasikan 36 variabel prediktif heterogen (geometri candle, Smart Money Concepts, momentum, tren H4, intermarket DXY, dan rilis berita makroekonomi) secara sinkron tanpa kebocoran data masa depan (lookahead bias).</w:t>
+        <w:t>Membangun dan menguji pipeline Multi-Source Feature Fusion yang mampu mengintegrasikan 44 variabel prediktif heterogen (geometri candle, Smart Money Concepts, momentum, tren &amp; slope H4, intermarket DXY, serta variabel makroekonomi dinamis kontinu) secara sinkron tanpa kebocoran data masa depan (lookahead bias).</w:t>
       </w:r>
     </w:p>
     <w:p>
@@ -544,28 +524,21 @@
           <w:rFonts w:ascii="Times New Roman" w:hAnsi="Times New Roman"/>
           <w:sz w:val="24"/>
         </w:rPr>
-        <w:t>Mengembangkan model klasifikasi probabilitas terkalibrasi berbasis algoritma LightGBM yang mampu memprediksi arah pergerakan harga XAUUSD secara akurat dan menyaring kondisi pasar konsolidasi (noise/sideways) melalui penetapan ambang keyakinan tinggi (≥ 65%).</w:t>
+        <w:t>Mengembangkan model klasifikasi probabilitas terkalibrasi berbasis algoritma LightGBM dengan optimasi regularisasi L1/L2 yang mampu memprediksi arah pergerakan harga XAUUSD secara akurat, meredam overfitting terhadap derau acak pasar, dan menyaring kondisi pasar konsolidasi (noise/sideways) melalui penetapan ambang keyakinan tinggi (≥ 65%).</w:t>
       </w:r>
     </w:p>
     <w:p>
       <w:pPr>
-        <w:spacing w:line="360" w:lineRule="auto" w:after="80"/>
+        <w:spacing w:line="360" w:lineRule="auto" w:after="120"/>
         <w:ind w:left="562" w:hanging="360"/>
       </w:pPr>
-      <w:r>
-        <w:rPr>
-          <w:rFonts w:ascii="Times New Roman" w:hAnsi="Times New Roman"/>
-          <w:b/>
-          <w:sz w:val="24"/>
-        </w:rPr>
-        <w:t xml:space="preserve">3. </w:t>
-      </w:r>
+      <w:r/>
       <w:r>
         <w:rPr>
           <w:rFonts w:ascii="Times New Roman" w:hAnsi="Times New Roman"/>
           <w:sz w:val="24"/>
         </w:rPr>
-        <w:t>Mengimplementasikan sistem eksekusi perdagangan terotomasi zero-delay terintegrasi MetaTrader 5 API yang dilengkapi modul manajemen risiko adaptif (Dynamic ATR SL, RRR 1 : 2.5, batas kerugian harian, dan jeda cooldown pasca-loss).</w:t>
+        <w:t>3. Mengimplementasikan sistem eksekusi perdagangan terotomasi zero-delay terintegrasi MetaTrader 5 API berbasis Two-Tier Architecture yang memadukan klasifikasi probabilitas LightGBM dengan mesin eksekusi struktural SMC (Structural Dynamic RRR, jangkar level kunci D1 30-hari, eksekusi hibrida berbatas waktu, filter proteksi anti counter-trend H4, Pre-News Caution Guard, Auto Break-Even Point preservation, pembatasan kerugian harian, dan jeda cooldown pasca-loss).</w:t>
       </w:r>
     </w:p>
     <w:p>
@@ -770,7 +743,7 @@
           <w:rFonts w:ascii="Times New Roman" w:hAnsi="Times New Roman"/>
           <w:sz w:val="24"/>
         </w:rPr>
-        <w:t>Keaslian penelitian ini didasarkan pada perbandingan komprehensif terhadap sejumlah penelitian terdahulu yang relevan di bidang peramalan harga emas, algoritma pembelajaran mesin pada instrumen finansial, dan pemodelan data deret waktu kuantitatif. Penelitian terdahulu yang dijadikan rujukan mencakup artikel jurnal internasional bereputasi (Scopus Q1/Q2), artikel jurnal nasional terakreditasi SINTA, serta naskah ilmiah mutakhir (arXiv 2024–2026). Berdasarkan kajian terhadap literatur tersebut, belum ditemukan penelitian yang mengintegrasikan algoritma LightGBM dengan 36 variabel Multi-Source Feature Fusion (SMC + Multi-Timeframe + Makroekonomi DXY/News), klasifikasi probabilitas terkalibrasi tinggi (≥ 65%), serta eksekusi forward testing real-time berbasis MetaTrader 5 yang dilengkapi Post-Trade Scenario Evaluator Engine. Ringkasan komparasi antara penelitian terdahulu dan posisi orisinalitas penelitian ini disajikan pada Tabel 1.1.</w:t>
+        <w:t>Keaslian penelitian ini didasarkan pada perbandingan komprehensif terhadap sejumlah penelitian terdahulu yang relevan di bidang peramalan harga emas, algoritma pembelajaran mesin pada instrumen finansial, dan pemodelan data deret waktu kuantitatif. Penelitian terdahulu yang dijadikan rujukan mencakup artikel jurnal internasional bereputasi (Scopus Q1/Q2), artikel jurnal nasional terakreditasi SINTA, serta naskah ilmiah mutakhir (arXiv 2024–2026). Berdasarkan kajian terhadap literatur tersebut, belum ditemukan penelitian yang mengintegrasikan algoritma LightGBM dengan 44 variabel Multi-Source Feature Fusion (SMC + Multi-Timeframe H4 + Makroekonomi Dinamis &amp; Intermarket DXY), penerapan regularisasi L1/L2, klasifikasi probabilitas terkalibrasi tinggi (≥ 65%), serta eksekusi forward testing real-time berbasis MetaTrader 5 yang dilengkapi proteksi anti counter-trend dan Post-Trade Scenario Evaluator Engine. Ringkasan komparasi antara penelitian terdahulu dan posisi orisinalitas penelitian ini disajikan pada Tabel 1.1.</w:t>
       </w:r>
     </w:p>
     <w:p>
@@ -1592,7 +1565,7 @@
                 <w:rFonts w:ascii="Times New Roman" w:hAnsi="Times New Roman"/>
                 <w:sz w:val="18"/>
               </w:rPr>
-              <w:t>Mengandalkan arsitektur Deep Learning (LSTM) yang lambat untuk inferensi real-time, tidak menguji pada timeframe intraday (M15/M5), tidak memasukkan intermarket DXY, dan belum diuji pada eksekusi forward testing pasar nyata.</w:t>
+              <w:t>Mengandalkan arsitektur Deep Learning (LSTM) yang lambat untuk inferensi real-time, tidak menguji pada timeframe intraday (M15), tidak memasukkan intermarket DXY, dan belum diuji pada eksekusi forward testing pasar nyata.</w:t>
             </w:r>
           </w:p>
         </w:tc>
@@ -1904,7 +1877,7 @@
                 <w:rFonts w:ascii="Times New Roman" w:hAnsi="Times New Roman"/>
                 <w:sz w:val="18"/>
               </w:rPr>
-              <w:t>Skala waktu harian tanpa arsitektur multi-timeframe intraday (M15-M5-H4), pipeline data terlalu lambat untuk eksekusi intraday, dan ketiadaan confidence guard untuk menyaring kondisi pasar konsolidasi (choppy market).</w:t>
+              <w:t>Skala waktu harian tanpa arsitektur multi-timeframe intraday (M15-H1-H4), pipeline data terlalu lambat untuk eksekusi intraday, dan ketiadaan confidence guard untuk menyaring kondisi pasar konsolidasi (choppy market).</w:t>
             </w:r>
           </w:p>
         </w:tc>
@@ -2443,7 +2416,7 @@
                 <w:b w:val="0"/>
                 <w:sz w:val="18"/>
               </w:rPr>
-              <w:t>XAUUSD Pasar Spot Riil (Multi-Timeframe M15 &amp; M5 dengan konfirmasi H4)</w:t>
+              <w:t>XAUUSD Pasar Spot Riil (Timeframe Utama M15 dengan konfirmasi H1 dan H4)</w:t>
             </w:r>
           </w:p>
         </w:tc>
@@ -2466,7 +2439,7 @@
                 <w:b/>
                 <w:sz w:val="18"/>
               </w:rPr>
-              <w:t>LightGBM Classifier Teroptimasi dengan Balanced Class Weights &amp; Confidence Guard (&gt;= 65%)</w:t>
+              <w:t>LightGBM Classifier Teroptimasi dengan Regularisasi L1/L2, Balanced Class Weights, Anti Counter-Trend Guard &amp; Confidence Guard (&gt;= 65%)</w:t>
             </w:r>
           </w:p>
         </w:tc>
@@ -2489,7 +2462,7 @@
                 <w:b w:val="0"/>
                 <w:sz w:val="18"/>
               </w:rPr>
-              <w:t>36 Variabel Multi-Source Feature Fusion: Geometri M15/M5, SMC (Order Block Bull &amp; Bear, FVG Bull &amp; Bear, BOS, CHoCH, Sweep), Fibo 100 candle, Jangkar Tren H4 (EMA 50/200), Kanal DXY (XAU/DXY Return, Tren DXY), dan Fitur Siklus Berita Makro (NFP, CPI, FOMC).</w:t>
+              <w:t>44 Variabel Multi-Source Feature Fusion: Geometri M15, SMC (Order Block Bull &amp; Bear, FVG Bull &amp; Bear, BOS, CHoCH, Sweep), Fibo 100 candle, Jangkar &amp; Slope Tren H4 (EMA 50/200, slope kanal -0.3, ADX 14), Kanal DXY (XAU/DXY Return multi-lag, Tren DXY), serta Fitur Makroekonomi Dinamis (Minutes to High News, deviasi ekspektasi Forecast vs Previous, bobot dampak berita, dan siklus NFP, CPI, FOMC).</w:t>
             </w:r>
           </w:p>
         </w:tc>
@@ -2512,7 +2485,7 @@
                 <w:b w:val="0"/>
                 <w:sz w:val="18"/>
               </w:rPr>
-              <w:t>Akurasi Sinyal High-Conviction (&gt;= 65%) mencapai 74.77% pada M15 (ROC-AUC 0.595) dan 79.26% pada M5 (ROC-AUC 0.618). Live forward testing otomatis menghasilkan eksekusi presisi dengan RRR 1 : 2.5.</w:t>
+              <w:t>Akurasi Sinyal High-Conviction (&gt;= 65%) mencapai 74.77% pada M15 (ROC-AUC 0.595). Live forward testing otomatis menghasilkan eksekusi presisi dengan RRR 1 : 2.5.</w:t>
             </w:r>
           </w:p>
         </w:tc>
@@ -2535,7 +2508,7 @@
                 <w:b/>
                 <w:sz w:val="18"/>
               </w:rPr>
-              <w:t>MENGISI SELURUH GAP PENELITIAN: Memadukan 4 domain fitur heterogen (SMC + MTF H4 + DXY + Berita Makro), mengusung klasifikasi probabilitas terkalibrasi tinggi (&gt;= 65%) berbasis LightGBM ultra-cepat, eksekusi real-time zero-delay via MetaTrader 5 API dengan Dynamic ATR SL, serta dilengkapi Post-Trade Scenario Evaluator Engine untuk continuous learning dan evaluasi 5–10x skenario.</w:t>
+              <w:t>MENGISI SELURUH GAP PENELITIAN: Memadukan 4 domain fitur heterogen (SMC + MTF H4 + DXY + Makroekonomi Dinamis), mengusung klasifikasi probabilitas terkalibrasi tinggi (&gt;= 65%) berbasis LightGBM ultra-cepat teregularisasi L1/L2, proteksi Anti Counter-Trend H4 &amp; Pre-News Caution, eksekusi real-time zero-delay via MetaTrader 5 API dengan Dynamic ATR SL, serta dilengkapi Post-Trade Scenario Evaluator Engine untuk continuous learning dan evaluasi 5–10x skenario.</w:t>
             </w:r>
           </w:p>
         </w:tc>

</xml_diff>